<commit_message>
add the new error theme and duplicate entry fix
</commit_message>
<xml_diff>
--- a/promts.docx
+++ b/promts.docx
@@ -1,6 +1,6 @@
 
 <file path=word/document.xml><?xml version="1.0" encoding="utf-8"?>
-<w:document xmlns:wpc="http://schemas.microsoft.com/office/word/2010/wordprocessingCanvas" xmlns:cx="http://schemas.microsoft.com/office/drawing/2014/chartex" xmlns:cx1="http://schemas.microsoft.com/office/drawing/2015/9/8/chartex" xmlns:cx2="http://schemas.microsoft.com/office/drawing/2015/10/21/chartex" xmlns:cx3="http://schemas.microsoft.com/office/drawing/2016/5/9/chartex" xmlns:cx4="http://schemas.microsoft.com/office/drawing/2016/5/10/chartex" xmlns:cx5="http://schemas.microsoft.com/office/drawing/2016/5/11/chartex" xmlns:cx6="http://schemas.microsoft.com/office/drawing/2016/5/12/chartex" xmlns:cx7="http://schemas.microsoft.com/office/drawing/2016/5/13/chartex" xmlns:cx8="http://schemas.microsoft.com/office/drawing/2016/5/14/chartex" xmlns:mc="http://schemas.openxmlformats.org/markup-compatibility/2006" xmlns:aink="http://schemas.microsoft.com/office/drawing/2016/ink" xmlns:am3d="http://schemas.microsoft.com/office/drawing/2017/model3d" xmlns:o="urn:schemas-microsoft-com:office:office" xmlns:oel="http://schemas.microsoft.com/office/2019/extlst" xmlns:r="http://schemas.openxmlformats.org/officeDocument/2006/relationships" xmlns:m="http://schemas.openxmlformats.org/officeDocument/2006/math" xmlns:v="urn:schemas-microsoft-com:vml" xmlns:wp14="http://schemas.microsoft.com/office/word/2010/wordprocessingDrawing" xmlns:wp="http://schemas.openxmlformats.org/drawingml/2006/wordprocessingDrawing" xmlns:w10="urn:schemas-microsoft-com:office:word" xmlns:w="http://schemas.openxmlformats.org/wordprocessingml/2006/main" xmlns:w14="http://schemas.microsoft.com/office/word/2010/wordml" xmlns:w15="http://schemas.microsoft.com/office/word/2012/wordml" xmlns:w16cex="http://schemas.microsoft.com/office/word/2018/wordml/cex" xmlns:w16cid="http://schemas.microsoft.com/office/word/2016/wordml/cid" xmlns:w16="http://schemas.microsoft.com/office/word/2018/wordml" xmlns:w16du="http://schemas.microsoft.com/office/word/2023/wordml/word16du" xmlns:w16sdtdh="http://schemas.microsoft.com/office/word/2020/wordml/sdtdatahash" xmlns:w16sdtfl="http://schemas.microsoft.com/office/word/2024/wordml/sdtformatlock" xmlns:w16se="http://schemas.microsoft.com/office/word/2015/wordml/symex" xmlns:wpg="http://schemas.microsoft.com/office/word/2010/wordprocessingGroup" xmlns:wpi="http://schemas.microsoft.com/office/word/2010/wordprocessingInk" xmlns:wne="http://schemas.microsoft.com/office/word/2006/wordml" xmlns:wps="http://schemas.microsoft.com/office/word/2010/wordprocessingShape" mc:Ignorable="w14 w15 w16se w16cid w16 w16cex w16sdtdh w16sdtfl w16du wp14">
+<w:document xmlns:wpc="http://schemas.microsoft.com/office/word/2010/wordprocessingCanvas" xmlns:cx="http://schemas.microsoft.com/office/drawing/2014/chartex" xmlns:cx1="http://schemas.microsoft.com/office/drawing/2015/9/8/chartex" xmlns:cx2="http://schemas.microsoft.com/office/drawing/2015/10/21/chartex" xmlns:cx3="http://schemas.microsoft.com/office/drawing/2016/5/9/chartex" xmlns:cx4="http://schemas.microsoft.com/office/drawing/2016/5/10/chartex" xmlns:cx5="http://schemas.microsoft.com/office/drawing/2016/5/11/chartex" xmlns:cx6="http://schemas.microsoft.com/office/drawing/2016/5/12/chartex" xmlns:cx7="http://schemas.microsoft.com/office/drawing/2016/5/13/chartex" xmlns:cx8="http://schemas.microsoft.com/office/drawing/2016/5/14/chartex" xmlns:mc="http://schemas.openxmlformats.org/markup-compatibility/2006" xmlns:aink="http://schemas.microsoft.com/office/drawing/2016/ink" xmlns:am3d="http://schemas.microsoft.com/office/drawing/2017/model3d" xmlns:o="urn:schemas-microsoft-com:office:office" xmlns:r="http://schemas.openxmlformats.org/officeDocument/2006/relationships" xmlns:m="http://schemas.openxmlformats.org/officeDocument/2006/math" xmlns:v="urn:schemas-microsoft-com:vml" xmlns:wp14="http://schemas.microsoft.com/office/word/2010/wordprocessingDrawing" xmlns:wp="http://schemas.openxmlformats.org/drawingml/2006/wordprocessingDrawing" xmlns:w10="urn:schemas-microsoft-com:office:word" xmlns:w="http://schemas.openxmlformats.org/wordprocessingml/2006/main" xmlns:w14="http://schemas.microsoft.com/office/word/2010/wordml" xmlns:w15="http://schemas.microsoft.com/office/word/2012/wordml" xmlns:w16cex="http://schemas.microsoft.com/office/word/2018/wordml/cex" xmlns:w16cid="http://schemas.microsoft.com/office/word/2016/wordml/cid" xmlns:w16="http://schemas.microsoft.com/office/word/2018/wordml" xmlns:w16sdtdh="http://schemas.microsoft.com/office/word/2020/wordml/sdtdatahash" xmlns:w16se="http://schemas.microsoft.com/office/word/2015/wordml/symex" xmlns:wpg="http://schemas.microsoft.com/office/word/2010/wordprocessingGroup" xmlns:wpi="http://schemas.microsoft.com/office/word/2010/wordprocessingInk" xmlns:wne="http://schemas.microsoft.com/office/word/2006/wordml" xmlns:wps="http://schemas.microsoft.com/office/word/2010/wordprocessingShape" mc:Ignorable="w14 w15 w16se w16cid w16 w16cex w16sdtdh wp14">
   <w:body>
     <w:p>
       <w:pPr>
@@ -25,12 +25,31 @@
     </w:p>
     <w:p>
       <w:r>
-        <w:t xml:space="preserve">  Calculator' and 'Study Timer' tabs, and a sidebar for 'Upcoming Events'. Ensure a clean, responsive layout using .navbar and   </w:t>
-      </w:r>
-    </w:p>
-    <w:p>
-      <w:r>
-        <w:t xml:space="preserve">  .sidebar classes."</w:t>
+        <w:t xml:space="preserve">  Calculator' and 'Study Timer' tabs, and a sidebar for 'Upcoming Events'. Ensure a clean, responsive layout </w:t>
+      </w:r>
+      <w:proofErr w:type="gramStart"/>
+      <w:r>
+        <w:t>using .navbar</w:t>
+      </w:r>
+      <w:proofErr w:type="gramEnd"/>
+      <w:r>
+        <w:t xml:space="preserve"> and  </w:t>
+      </w:r>
+      <w:r>
+        <w:t xml:space="preserve"> </w:t>
+      </w:r>
+    </w:p>
+    <w:p>
+      <w:r>
+        <w:t xml:space="preserve">  </w:t>
+      </w:r>
+      <w:proofErr w:type="gramStart"/>
+      <w:r>
+        <w:t>.sidebar</w:t>
+      </w:r>
+      <w:proofErr w:type="gramEnd"/>
+      <w:r>
+        <w:t xml:space="preserve"> classes."</w:t>
       </w:r>
     </w:p>
     <w:p/>
@@ -56,7 +75,10 @@
     </w:p>
     <w:p>
       <w:r>
-        <w:t xml:space="preserve">   Pomodoro Timer: Add a 25-minute countdown timer with Start/Reset controls and a completion alert</w:t>
+        <w:t xml:space="preserve">   Pomodoro Timer: Add a 25-minute countdown timer with Start/Reset control</w:t>
+      </w:r>
+      <w:r>
+        <w:t>s and a completion alert</w:t>
       </w:r>
     </w:p>
     <w:p>
@@ -97,7 +119,15 @@
     </w:p>
     <w:p>
       <w:r>
-        <w:t xml:space="preserve">         them glow and expand slightly using scale and box-shadow.</w:t>
+        <w:t xml:space="preserve">         </w:t>
+      </w:r>
+      <w:proofErr w:type="spellStart"/>
+      <w:r>
+        <w:t>them</w:t>
+      </w:r>
+      <w:proofErr w:type="spellEnd"/>
+      <w:r>
+        <w:t xml:space="preserve"> glow and expand slightly using scale and box-shadow.</w:t>
       </w:r>
     </w:p>
     <w:p>
@@ -160,6 +190,189 @@
       </w:r>
     </w:p>
     <w:p/>
+    <w:p>
+      <w:pPr>
+        <w:rPr>
+          <w:b/>
+          <w:bCs/>
+          <w:sz w:val="36"/>
+          <w:szCs w:val="36"/>
+        </w:rPr>
+      </w:pPr>
+      <w:r>
+        <w:rPr>
+          <w:b/>
+          <w:bCs/>
+          <w:sz w:val="36"/>
+          <w:szCs w:val="36"/>
+        </w:rPr>
+        <w:t xml:space="preserve">DAY 5 </w:t>
+      </w:r>
+    </w:p>
+    <w:p>
+      <w:r>
+        <w:t xml:space="preserve">We already fix the empty idea entry </w:t>
+      </w:r>
+      <w:proofErr w:type="gramStart"/>
+      <w:r>
+        <w:t>In</w:t>
+      </w:r>
+      <w:proofErr w:type="gramEnd"/>
+      <w:r>
+        <w:t xml:space="preserve"> yesterday.</w:t>
+      </w:r>
+    </w:p>
+    <w:p>
+      <w:r>
+        <w:t xml:space="preserve">But we make the error look more </w:t>
+      </w:r>
+      <w:proofErr w:type="spellStart"/>
+      <w:r>
+        <w:t>elegent</w:t>
+      </w:r>
+      <w:proofErr w:type="spellEnd"/>
+      <w:r>
+        <w:t xml:space="preserve"> using new </w:t>
+      </w:r>
+      <w:proofErr w:type="spellStart"/>
+      <w:proofErr w:type="gramStart"/>
+      <w:r>
+        <w:t>prompts.also</w:t>
+      </w:r>
+      <w:proofErr w:type="spellEnd"/>
+      <w:proofErr w:type="gramEnd"/>
+      <w:r>
+        <w:t xml:space="preserve"> we add correct the issue with the duplicate same idea entry.</w:t>
+      </w:r>
+    </w:p>
+    <w:p>
+      <w:pPr>
+        <w:rPr>
+          <w:b/>
+          <w:bCs/>
+        </w:rPr>
+      </w:pPr>
+      <w:r>
+        <w:rPr>
+          <w:b/>
+          <w:bCs/>
+        </w:rPr>
+        <w:t xml:space="preserve">Prompts that we use to correct </w:t>
+      </w:r>
+      <w:proofErr w:type="gramStart"/>
+      <w:r>
+        <w:rPr>
+          <w:b/>
+          <w:bCs/>
+        </w:rPr>
+        <w:t>that issues</w:t>
+      </w:r>
+      <w:proofErr w:type="gramEnd"/>
+      <w:r>
+        <w:rPr>
+          <w:b/>
+          <w:bCs/>
+        </w:rPr>
+        <w:t>.</w:t>
+      </w:r>
+    </w:p>
+    <w:p>
+      <w:r>
+        <w:t>1.</w:t>
+      </w:r>
+      <w:r>
+        <w:t xml:space="preserve">"if someone enter same idea in the this have to give </w:t>
+      </w:r>
+      <w:proofErr w:type="spellStart"/>
+      <w:proofErr w:type="gramStart"/>
+      <w:r>
+        <w:t>a</w:t>
+      </w:r>
+      <w:proofErr w:type="spellEnd"/>
+      <w:proofErr w:type="gramEnd"/>
+      <w:r>
+        <w:t xml:space="preserve"> error of the idea is already exist kindly enter new idea</w:t>
+      </w:r>
+    </w:p>
+    <w:p>
+      <w:r>
+        <w:t xml:space="preserve">      for the idea borad"</w:t>
+      </w:r>
+    </w:p>
+    <w:p>
+      <w:r>
+        <w:t xml:space="preserve">2. "make the error look like very </w:t>
+      </w:r>
+      <w:proofErr w:type="spellStart"/>
+      <w:r>
+        <w:t>interseting</w:t>
+      </w:r>
+      <w:proofErr w:type="spellEnd"/>
+      <w:r>
+        <w:t xml:space="preserve"> in </w:t>
+      </w:r>
+      <w:proofErr w:type="spellStart"/>
+      <w:r>
+        <w:t>ux</w:t>
+      </w:r>
+      <w:proofErr w:type="spellEnd"/>
+      <w:r>
+        <w:t xml:space="preserve"> </w:t>
+      </w:r>
+      <w:proofErr w:type="spellStart"/>
+      <w:r>
+        <w:t>ui</w:t>
+      </w:r>
+      <w:proofErr w:type="spellEnd"/>
+      <w:r>
+        <w:t xml:space="preserve"> it </w:t>
+      </w:r>
+      <w:proofErr w:type="gramStart"/>
+      <w:r>
+        <w:t>have</w:t>
+      </w:r>
+      <w:proofErr w:type="gramEnd"/>
+      <w:r>
+        <w:t xml:space="preserve"> to be </w:t>
+      </w:r>
+      <w:proofErr w:type="spellStart"/>
+      <w:r>
+        <w:t>legent</w:t>
+      </w:r>
+      <w:proofErr w:type="spellEnd"/>
+      <w:r>
+        <w:t xml:space="preserve"> and have to match both light and dark</w:t>
+      </w:r>
+    </w:p>
+    <w:p>
+      <w:r>
+        <w:t xml:space="preserve">      </w:t>
+      </w:r>
+      <w:proofErr w:type="spellStart"/>
+      <w:r>
+        <w:t>theam</w:t>
+      </w:r>
+      <w:proofErr w:type="spellEnd"/>
+      <w:r>
+        <w:t>"</w:t>
+      </w:r>
+    </w:p>
+    <w:p>
+      <w:pPr>
+        <w:ind w:firstLine="720"/>
+        <w:rPr>
+          <w:sz w:val="18"/>
+          <w:szCs w:val="18"/>
+        </w:rPr>
+      </w:pPr>
+      <w:r>
+        <w:rPr>
+          <w:sz w:val="28"/>
+          <w:szCs w:val="28"/>
+        </w:rPr>
+        <w:t xml:space="preserve"> </w:t>
+      </w:r>
+    </w:p>
     <w:sectPr>
       <w:pgSz w:w="12240" w:h="15840"/>
       <w:pgMar w:top="1440" w:right="1440" w:bottom="1440" w:left="1440" w:header="720" w:footer="720" w:gutter="0"/>
@@ -171,7 +384,7 @@
 </file>
 
 <file path=word/endnotes.xml><?xml version="1.0" encoding="utf-8"?>
-<w:endnotes xmlns:wpc="http://schemas.microsoft.com/office/word/2010/wordprocessingCanvas" xmlns:cx="http://schemas.microsoft.com/office/drawing/2014/chartex" xmlns:cx1="http://schemas.microsoft.com/office/drawing/2015/9/8/chartex" xmlns:cx2="http://schemas.microsoft.com/office/drawing/2015/10/21/chartex" xmlns:cx3="http://schemas.microsoft.com/office/drawing/2016/5/9/chartex" xmlns:cx4="http://schemas.microsoft.com/office/drawing/2016/5/10/chartex" xmlns:cx5="http://schemas.microsoft.com/office/drawing/2016/5/11/chartex" xmlns:cx6="http://schemas.microsoft.com/office/drawing/2016/5/12/chartex" xmlns:cx7="http://schemas.microsoft.com/office/drawing/2016/5/13/chartex" xmlns:cx8="http://schemas.microsoft.com/office/drawing/2016/5/14/chartex" xmlns:mc="http://schemas.openxmlformats.org/markup-compatibility/2006" xmlns:aink="http://schemas.microsoft.com/office/drawing/2016/ink" xmlns:am3d="http://schemas.microsoft.com/office/drawing/2017/model3d" xmlns:o="urn:schemas-microsoft-com:office:office" xmlns:oel="http://schemas.microsoft.com/office/2019/extlst" xmlns:r="http://schemas.openxmlformats.org/officeDocument/2006/relationships" xmlns:m="http://schemas.openxmlformats.org/officeDocument/2006/math" xmlns:v="urn:schemas-microsoft-com:vml" xmlns:wp14="http://schemas.microsoft.com/office/word/2010/wordprocessingDrawing" xmlns:wp="http://schemas.openxmlformats.org/drawingml/2006/wordprocessingDrawing" xmlns:w10="urn:schemas-microsoft-com:office:word" xmlns:w="http://schemas.openxmlformats.org/wordprocessingml/2006/main" xmlns:w14="http://schemas.microsoft.com/office/word/2010/wordml" xmlns:w15="http://schemas.microsoft.com/office/word/2012/wordml" xmlns:w16cex="http://schemas.microsoft.com/office/word/2018/wordml/cex" xmlns:w16cid="http://schemas.microsoft.com/office/word/2016/wordml/cid" xmlns:w16="http://schemas.microsoft.com/office/word/2018/wordml" xmlns:w16du="http://schemas.microsoft.com/office/word/2023/wordml/word16du" xmlns:w16sdtdh="http://schemas.microsoft.com/office/word/2020/wordml/sdtdatahash" xmlns:w16sdtfl="http://schemas.microsoft.com/office/word/2024/wordml/sdtformatlock" xmlns:w16se="http://schemas.microsoft.com/office/word/2015/wordml/symex" xmlns:wpg="http://schemas.microsoft.com/office/word/2010/wordprocessingGroup" xmlns:wpi="http://schemas.microsoft.com/office/word/2010/wordprocessingInk" xmlns:wne="http://schemas.microsoft.com/office/word/2006/wordml" xmlns:wps="http://schemas.microsoft.com/office/word/2010/wordprocessingShape" mc:Ignorable="w14 w15 w16se w16cid w16 w16cex w16sdtdh w16sdtfl w16du wp14">
+<w:endnotes xmlns:wpc="http://schemas.microsoft.com/office/word/2010/wordprocessingCanvas" xmlns:cx="http://schemas.microsoft.com/office/drawing/2014/chartex" xmlns:cx1="http://schemas.microsoft.com/office/drawing/2015/9/8/chartex" xmlns:cx2="http://schemas.microsoft.com/office/drawing/2015/10/21/chartex" xmlns:cx3="http://schemas.microsoft.com/office/drawing/2016/5/9/chartex" xmlns:cx4="http://schemas.microsoft.com/office/drawing/2016/5/10/chartex" xmlns:cx5="http://schemas.microsoft.com/office/drawing/2016/5/11/chartex" xmlns:cx6="http://schemas.microsoft.com/office/drawing/2016/5/12/chartex" xmlns:cx7="http://schemas.microsoft.com/office/drawing/2016/5/13/chartex" xmlns:cx8="http://schemas.microsoft.com/office/drawing/2016/5/14/chartex" xmlns:mc="http://schemas.openxmlformats.org/markup-compatibility/2006" xmlns:aink="http://schemas.microsoft.com/office/drawing/2016/ink" xmlns:am3d="http://schemas.microsoft.com/office/drawing/2017/model3d" xmlns:o="urn:schemas-microsoft-com:office:office" xmlns:r="http://schemas.openxmlformats.org/officeDocument/2006/relationships" xmlns:m="http://schemas.openxmlformats.org/officeDocument/2006/math" xmlns:v="urn:schemas-microsoft-com:vml" xmlns:wp14="http://schemas.microsoft.com/office/word/2010/wordprocessingDrawing" xmlns:wp="http://schemas.openxmlformats.org/drawingml/2006/wordprocessingDrawing" xmlns:w10="urn:schemas-microsoft-com:office:word" xmlns:w="http://schemas.openxmlformats.org/wordprocessingml/2006/main" xmlns:w14="http://schemas.microsoft.com/office/word/2010/wordml" xmlns:w15="http://schemas.microsoft.com/office/word/2012/wordml" xmlns:w16cex="http://schemas.microsoft.com/office/word/2018/wordml/cex" xmlns:w16cid="http://schemas.microsoft.com/office/word/2016/wordml/cid" xmlns:w16="http://schemas.microsoft.com/office/word/2018/wordml" xmlns:w16sdtdh="http://schemas.microsoft.com/office/word/2020/wordml/sdtdatahash" xmlns:w16se="http://schemas.microsoft.com/office/word/2015/wordml/symex" xmlns:wpg="http://schemas.microsoft.com/office/word/2010/wordprocessingGroup" xmlns:wpi="http://schemas.microsoft.com/office/word/2010/wordprocessingInk" xmlns:wne="http://schemas.microsoft.com/office/word/2006/wordml" xmlns:wps="http://schemas.microsoft.com/office/word/2010/wordprocessingShape" mc:Ignorable="w14 w15 w16se w16cid w16 w16cex w16sdtdh wp14">
   <w:endnote w:type="separator" w:id="-1">
     <w:p>
       <w:pPr>
@@ -196,7 +409,7 @@
 </file>
 
 <file path=word/footnotes.xml><?xml version="1.0" encoding="utf-8"?>
-<w:footnotes xmlns:wpc="http://schemas.microsoft.com/office/word/2010/wordprocessingCanvas" xmlns:cx="http://schemas.microsoft.com/office/drawing/2014/chartex" xmlns:cx1="http://schemas.microsoft.com/office/drawing/2015/9/8/chartex" xmlns:cx2="http://schemas.microsoft.com/office/drawing/2015/10/21/chartex" xmlns:cx3="http://schemas.microsoft.com/office/drawing/2016/5/9/chartex" xmlns:cx4="http://schemas.microsoft.com/office/drawing/2016/5/10/chartex" xmlns:cx5="http://schemas.microsoft.com/office/drawing/2016/5/11/chartex" xmlns:cx6="http://schemas.microsoft.com/office/drawing/2016/5/12/chartex" xmlns:cx7="http://schemas.microsoft.com/office/drawing/2016/5/13/chartex" xmlns:cx8="http://schemas.microsoft.com/office/drawing/2016/5/14/chartex" xmlns:mc="http://schemas.openxmlformats.org/markup-compatibility/2006" xmlns:aink="http://schemas.microsoft.com/office/drawing/2016/ink" xmlns:am3d="http://schemas.microsoft.com/office/drawing/2017/model3d" xmlns:o="urn:schemas-microsoft-com:office:office" xmlns:oel="http://schemas.microsoft.com/office/2019/extlst" xmlns:r="http://schemas.openxmlformats.org/officeDocument/2006/relationships" xmlns:m="http://schemas.openxmlformats.org/officeDocument/2006/math" xmlns:v="urn:schemas-microsoft-com:vml" xmlns:wp14="http://schemas.microsoft.com/office/word/2010/wordprocessingDrawing" xmlns:wp="http://schemas.openxmlformats.org/drawingml/2006/wordprocessingDrawing" xmlns:w10="urn:schemas-microsoft-com:office:word" xmlns:w="http://schemas.openxmlformats.org/wordprocessingml/2006/main" xmlns:w14="http://schemas.microsoft.com/office/word/2010/wordml" xmlns:w15="http://schemas.microsoft.com/office/word/2012/wordml" xmlns:w16cex="http://schemas.microsoft.com/office/word/2018/wordml/cex" xmlns:w16cid="http://schemas.microsoft.com/office/word/2016/wordml/cid" xmlns:w16="http://schemas.microsoft.com/office/word/2018/wordml" xmlns:w16du="http://schemas.microsoft.com/office/word/2023/wordml/word16du" xmlns:w16sdtdh="http://schemas.microsoft.com/office/word/2020/wordml/sdtdatahash" xmlns:w16sdtfl="http://schemas.microsoft.com/office/word/2024/wordml/sdtformatlock" xmlns:w16se="http://schemas.microsoft.com/office/word/2015/wordml/symex" xmlns:wpg="http://schemas.microsoft.com/office/word/2010/wordprocessingGroup" xmlns:wpi="http://schemas.microsoft.com/office/word/2010/wordprocessingInk" xmlns:wne="http://schemas.microsoft.com/office/word/2006/wordml" xmlns:wps="http://schemas.microsoft.com/office/word/2010/wordprocessingShape" mc:Ignorable="w14 w15 w16se w16cid w16 w16cex w16sdtdh w16sdtfl w16du wp14">
+<w:footnotes xmlns:wpc="http://schemas.microsoft.com/office/word/2010/wordprocessingCanvas" xmlns:cx="http://schemas.microsoft.com/office/drawing/2014/chartex" xmlns:cx1="http://schemas.microsoft.com/office/drawing/2015/9/8/chartex" xmlns:cx2="http://schemas.microsoft.com/office/drawing/2015/10/21/chartex" xmlns:cx3="http://schemas.microsoft.com/office/drawing/2016/5/9/chartex" xmlns:cx4="http://schemas.microsoft.com/office/drawing/2016/5/10/chartex" xmlns:cx5="http://schemas.microsoft.com/office/drawing/2016/5/11/chartex" xmlns:cx6="http://schemas.microsoft.com/office/drawing/2016/5/12/chartex" xmlns:cx7="http://schemas.microsoft.com/office/drawing/2016/5/13/chartex" xmlns:cx8="http://schemas.microsoft.com/office/drawing/2016/5/14/chartex" xmlns:mc="http://schemas.openxmlformats.org/markup-compatibility/2006" xmlns:aink="http://schemas.microsoft.com/office/drawing/2016/ink" xmlns:am3d="http://schemas.microsoft.com/office/drawing/2017/model3d" xmlns:o="urn:schemas-microsoft-com:office:office" xmlns:r="http://schemas.openxmlformats.org/officeDocument/2006/relationships" xmlns:m="http://schemas.openxmlformats.org/officeDocument/2006/math" xmlns:v="urn:schemas-microsoft-com:vml" xmlns:wp14="http://schemas.microsoft.com/office/word/2010/wordprocessingDrawing" xmlns:wp="http://schemas.openxmlformats.org/drawingml/2006/wordprocessingDrawing" xmlns:w10="urn:schemas-microsoft-com:office:word" xmlns:w="http://schemas.openxmlformats.org/wordprocessingml/2006/main" xmlns:w14="http://schemas.microsoft.com/office/word/2010/wordml" xmlns:w15="http://schemas.microsoft.com/office/word/2012/wordml" xmlns:w16cex="http://schemas.microsoft.com/office/word/2018/wordml/cex" xmlns:w16cid="http://schemas.microsoft.com/office/word/2016/wordml/cid" xmlns:w16="http://schemas.microsoft.com/office/word/2018/wordml" xmlns:w16sdtdh="http://schemas.microsoft.com/office/word/2020/wordml/sdtdatahash" xmlns:w16se="http://schemas.microsoft.com/office/word/2015/wordml/symex" xmlns:wpg="http://schemas.microsoft.com/office/word/2010/wordprocessingGroup" xmlns:wpi="http://schemas.microsoft.com/office/word/2010/wordprocessingInk" xmlns:wne="http://schemas.microsoft.com/office/word/2006/wordml" xmlns:wps="http://schemas.microsoft.com/office/word/2010/wordprocessingShape" mc:Ignorable="w14 w15 w16se w16cid w16 w16cex w16sdtdh wp14">
   <w:footnote w:type="separator" w:id="-1">
     <w:p>
       <w:pPr>
@@ -221,7 +434,7 @@
 </file>
 
 <file path=word/styles.xml><?xml version="1.0" encoding="utf-8"?>
-<w:styles xmlns:mc="http://schemas.openxmlformats.org/markup-compatibility/2006" xmlns:r="http://schemas.openxmlformats.org/officeDocument/2006/relationships" xmlns:w="http://schemas.openxmlformats.org/wordprocessingml/2006/main" xmlns:w14="http://schemas.microsoft.com/office/word/2010/wordml" xmlns:w15="http://schemas.microsoft.com/office/word/2012/wordml" xmlns:w16cex="http://schemas.microsoft.com/office/word/2018/wordml/cex" xmlns:w16cid="http://schemas.microsoft.com/office/word/2016/wordml/cid" xmlns:w16="http://schemas.microsoft.com/office/word/2018/wordml" xmlns:w16du="http://schemas.microsoft.com/office/word/2023/wordml/word16du" xmlns:w16sdtdh="http://schemas.microsoft.com/office/word/2020/wordml/sdtdatahash" xmlns:w16sdtfl="http://schemas.microsoft.com/office/word/2024/wordml/sdtformatlock" xmlns:w16se="http://schemas.microsoft.com/office/word/2015/wordml/symex" mc:Ignorable="w14 w15 w16se w16cid w16 w16cex w16sdtdh w16sdtfl w16du">
+<w:styles xmlns:mc="http://schemas.openxmlformats.org/markup-compatibility/2006" xmlns:r="http://schemas.openxmlformats.org/officeDocument/2006/relationships" xmlns:w="http://schemas.openxmlformats.org/wordprocessingml/2006/main" xmlns:w14="http://schemas.microsoft.com/office/word/2010/wordml" xmlns:w15="http://schemas.microsoft.com/office/word/2012/wordml" xmlns:w16cex="http://schemas.microsoft.com/office/word/2018/wordml/cex" xmlns:w16cid="http://schemas.microsoft.com/office/word/2016/wordml/cid" xmlns:w16="http://schemas.microsoft.com/office/word/2018/wordml" xmlns:w16sdtdh="http://schemas.microsoft.com/office/word/2020/wordml/sdtdatahash" xmlns:w16se="http://schemas.microsoft.com/office/word/2015/wordml/symex" mc:Ignorable="w14 w15 w16se w16cid w16 w16cex w16sdtdh">
   <w:docDefaults>
     <w:rPrDefault>
       <w:rPr>

</xml_diff>

<commit_message>
improve the ui like error rapid apper and fix baby ai
</commit_message>
<xml_diff>
--- a/promts.docx
+++ b/promts.docx
@@ -1,6 +1,6 @@
 
 <file path=word/document.xml><?xml version="1.0" encoding="utf-8"?>
-<w:document xmlns:wpc="http://schemas.microsoft.com/office/word/2010/wordprocessingCanvas" xmlns:cx="http://schemas.microsoft.com/office/drawing/2014/chartex" xmlns:cx1="http://schemas.microsoft.com/office/drawing/2015/9/8/chartex" xmlns:cx2="http://schemas.microsoft.com/office/drawing/2015/10/21/chartex" xmlns:cx3="http://schemas.microsoft.com/office/drawing/2016/5/9/chartex" xmlns:cx4="http://schemas.microsoft.com/office/drawing/2016/5/10/chartex" xmlns:cx5="http://schemas.microsoft.com/office/drawing/2016/5/11/chartex" xmlns:cx6="http://schemas.microsoft.com/office/drawing/2016/5/12/chartex" xmlns:cx7="http://schemas.microsoft.com/office/drawing/2016/5/13/chartex" xmlns:cx8="http://schemas.microsoft.com/office/drawing/2016/5/14/chartex" xmlns:mc="http://schemas.openxmlformats.org/markup-compatibility/2006" xmlns:aink="http://schemas.microsoft.com/office/drawing/2016/ink" xmlns:am3d="http://schemas.microsoft.com/office/drawing/2017/model3d" xmlns:o="urn:schemas-microsoft-com:office:office" xmlns:oel="http://schemas.microsoft.com/office/2019/extlst" xmlns:r="http://schemas.openxmlformats.org/officeDocument/2006/relationships" xmlns:m="http://schemas.openxmlformats.org/officeDocument/2006/math" xmlns:v="urn:schemas-microsoft-com:vml" xmlns:wp14="http://schemas.microsoft.com/office/word/2010/wordprocessingDrawing" xmlns:wp="http://schemas.openxmlformats.org/drawingml/2006/wordprocessingDrawing" xmlns:w10="urn:schemas-microsoft-com:office:word" xmlns:w="http://schemas.openxmlformats.org/wordprocessingml/2006/main" xmlns:w14="http://schemas.microsoft.com/office/word/2010/wordml" xmlns:w15="http://schemas.microsoft.com/office/word/2012/wordml" xmlns:w16cex="http://schemas.microsoft.com/office/word/2018/wordml/cex" xmlns:w16cid="http://schemas.microsoft.com/office/word/2016/wordml/cid" xmlns:w16="http://schemas.microsoft.com/office/word/2018/wordml" xmlns:w16du="http://schemas.microsoft.com/office/word/2023/wordml/word16du" xmlns:w16sdtdh="http://schemas.microsoft.com/office/word/2020/wordml/sdtdatahash" xmlns:w16sdtfl="http://schemas.microsoft.com/office/word/2024/wordml/sdtformatlock" xmlns:w16se="http://schemas.microsoft.com/office/word/2015/wordml/symex" xmlns:wpg="http://schemas.microsoft.com/office/word/2010/wordprocessingGroup" xmlns:wpi="http://schemas.microsoft.com/office/word/2010/wordprocessingInk" xmlns:wne="http://schemas.microsoft.com/office/word/2006/wordml" xmlns:wps="http://schemas.microsoft.com/office/word/2010/wordprocessingShape" mc:Ignorable="w14 w15 w16se w16cid w16 w16cex w16sdtdh w16sdtfl w16du wp14">
+<w:document xmlns:wpc="http://schemas.microsoft.com/office/word/2010/wordprocessingCanvas" xmlns:cx="http://schemas.microsoft.com/office/drawing/2014/chartex" xmlns:cx1="http://schemas.microsoft.com/office/drawing/2015/9/8/chartex" xmlns:cx2="http://schemas.microsoft.com/office/drawing/2015/10/21/chartex" xmlns:cx3="http://schemas.microsoft.com/office/drawing/2016/5/9/chartex" xmlns:cx4="http://schemas.microsoft.com/office/drawing/2016/5/10/chartex" xmlns:cx5="http://schemas.microsoft.com/office/drawing/2016/5/11/chartex" xmlns:cx6="http://schemas.microsoft.com/office/drawing/2016/5/12/chartex" xmlns:cx7="http://schemas.microsoft.com/office/drawing/2016/5/13/chartex" xmlns:cx8="http://schemas.microsoft.com/office/drawing/2016/5/14/chartex" xmlns:mc="http://schemas.openxmlformats.org/markup-compatibility/2006" xmlns:aink="http://schemas.microsoft.com/office/drawing/2016/ink" xmlns:am3d="http://schemas.microsoft.com/office/drawing/2017/model3d" xmlns:o="urn:schemas-microsoft-com:office:office" xmlns:r="http://schemas.openxmlformats.org/officeDocument/2006/relationships" xmlns:m="http://schemas.openxmlformats.org/officeDocument/2006/math" xmlns:v="urn:schemas-microsoft-com:vml" xmlns:wp14="http://schemas.microsoft.com/office/word/2010/wordprocessingDrawing" xmlns:wp="http://schemas.openxmlformats.org/drawingml/2006/wordprocessingDrawing" xmlns:w10="urn:schemas-microsoft-com:office:word" xmlns:w="http://schemas.openxmlformats.org/wordprocessingml/2006/main" xmlns:w14="http://schemas.microsoft.com/office/word/2010/wordml" xmlns:w15="http://schemas.microsoft.com/office/word/2012/wordml" xmlns:w16cex="http://schemas.microsoft.com/office/word/2018/wordml/cex" xmlns:w16cid="http://schemas.microsoft.com/office/word/2016/wordml/cid" xmlns:w16="http://schemas.microsoft.com/office/word/2018/wordml" xmlns:w16sdtdh="http://schemas.microsoft.com/office/word/2020/wordml/sdtdatahash" xmlns:w16se="http://schemas.microsoft.com/office/word/2015/wordml/symex" xmlns:wpg="http://schemas.microsoft.com/office/word/2010/wordprocessingGroup" xmlns:wpi="http://schemas.microsoft.com/office/word/2010/wordprocessingInk" xmlns:wne="http://schemas.microsoft.com/office/word/2006/wordml" xmlns:wps="http://schemas.microsoft.com/office/word/2010/wordprocessingShape" mc:Ignorable="w14 w15 w16se w16cid w16 w16cex w16sdtdh wp14">
   <w:body>
     <w:p>
       <w:pPr>
@@ -25,12 +25,31 @@
     </w:p>
     <w:p>
       <w:r>
-        <w:t xml:space="preserve">  Calculator' and 'Study Timer' tabs, and a sidebar for 'Upcoming Events'. Ensure a clean, responsive layout using .navbar and   </w:t>
-      </w:r>
-    </w:p>
-    <w:p>
-      <w:r>
-        <w:t xml:space="preserve">  .sidebar classes."</w:t>
+        <w:t xml:space="preserve">  Calculator' and 'Study Timer' tabs, and a sidebar for 'Upcoming Events'. Ensure a clean, responsive layout </w:t>
+      </w:r>
+      <w:proofErr w:type="gramStart"/>
+      <w:r>
+        <w:t>using .navbar</w:t>
+      </w:r>
+      <w:proofErr w:type="gramEnd"/>
+      <w:r>
+        <w:t xml:space="preserve"> and  </w:t>
+      </w:r>
+      <w:r>
+        <w:t xml:space="preserve"> </w:t>
+      </w:r>
+    </w:p>
+    <w:p>
+      <w:r>
+        <w:t xml:space="preserve">  </w:t>
+      </w:r>
+      <w:proofErr w:type="gramStart"/>
+      <w:r>
+        <w:t>.sidebar</w:t>
+      </w:r>
+      <w:proofErr w:type="gramEnd"/>
+      <w:r>
+        <w:t xml:space="preserve"> classes."</w:t>
       </w:r>
     </w:p>
     <w:p/>
@@ -56,7 +75,10 @@
     </w:p>
     <w:p>
       <w:r>
-        <w:t xml:space="preserve">   Pomodoro Timer: Add a 25-minute countdown timer with Start/Reset controls and a completion alert</w:t>
+        <w:t xml:space="preserve">   Pomodoro Timer: Add a 25-minute countdown timer with Start/Reset control</w:t>
+      </w:r>
+      <w:r>
+        <w:t>s and a completion alert</w:t>
       </w:r>
     </w:p>
     <w:p>
@@ -82,7 +104,10 @@
     </w:p>
     <w:p>
       <w:r>
-        <w:t xml:space="preserve">       * Animations: Implement smooth fade-in animations for sections to appear gradually on page</w:t>
+        <w:t xml:space="preserve">       * Animations: Implement sm</w:t>
+      </w:r>
+      <w:r>
+        <w:t>ooth fade-in animations for sections to appear gradually on page</w:t>
       </w:r>
     </w:p>
     <w:p>
@@ -102,7 +127,10 @@
     </w:p>
     <w:p>
       <w:r>
-        <w:t xml:space="preserve">       * UCSC Branding:</w:t>
+        <w:t xml:space="preserve">       * </w:t>
+      </w:r>
+      <w:r>
+        <w:t>UCSC Branding:</w:t>
       </w:r>
     </w:p>
     <w:p>
@@ -124,7 +152,10 @@
     </w:p>
     <w:p>
       <w:r>
-        <w:t xml:space="preserve">       * Added logic to the JavaScript to re-trigger the fade-in animation whenever the user switches</w:t>
+        <w:t xml:space="preserve">       * Added logic to the JavaScript to re-trigger the fade-in a</w:t>
+      </w:r>
+      <w:r>
+        <w:t>nimation whenever the user switches</w:t>
       </w:r>
     </w:p>
     <w:p>
@@ -151,7 +182,10 @@
     </w:p>
     <w:p>
       <w:r>
-        <w:t xml:space="preserve">       * Adjusted the CSS to ensure the image displays clearly with a transparent background and</w:t>
+        <w:t xml:space="preserve">       * Adjusted the CSS to ensure the image displays cle</w:t>
+      </w:r>
+      <w:r>
+        <w:t>arly with a transparent background and</w:t>
       </w:r>
     </w:p>
     <w:p>
@@ -181,7 +215,15 @@
     </w:p>
     <w:p>
       <w:r>
-        <w:t>We already fix the empty idea entry In yesterday.</w:t>
+        <w:t xml:space="preserve">We already fix the empty idea entry </w:t>
+      </w:r>
+      <w:proofErr w:type="gramStart"/>
+      <w:r>
+        <w:t>In</w:t>
+      </w:r>
+      <w:proofErr w:type="gramEnd"/>
+      <w:r>
+        <w:t xml:space="preserve"> yesterday.</w:t>
       </w:r>
     </w:p>
     <w:p>
@@ -197,10 +239,12 @@
         <w:t xml:space="preserve"> using new </w:t>
       </w:r>
       <w:proofErr w:type="spellStart"/>
+      <w:proofErr w:type="gramStart"/>
       <w:r>
         <w:t>prompts.also</w:t>
       </w:r>
       <w:proofErr w:type="spellEnd"/>
+      <w:proofErr w:type="gramEnd"/>
       <w:r>
         <w:t xml:space="preserve"> we add correct the issue with the duplicate same idea entry.</w:t>
       </w:r>
@@ -217,12 +261,43 @@
           <w:b/>
           <w:bCs/>
         </w:rPr>
-        <w:t>Prompts that we use to correct that issues.</w:t>
-      </w:r>
-    </w:p>
-    <w:p>
-      <w:r>
-        <w:t>1."if someone enter same idea in the this have to give a error of the idea is already exist kindly enter new idea</w:t>
+        <w:t>Prompt</w:t>
+      </w:r>
+      <w:r>
+        <w:rPr>
+          <w:b/>
+          <w:bCs/>
+        </w:rPr>
+        <w:t xml:space="preserve">s that we use to correct </w:t>
+      </w:r>
+      <w:proofErr w:type="gramStart"/>
+      <w:r>
+        <w:rPr>
+          <w:b/>
+          <w:bCs/>
+        </w:rPr>
+        <w:t>that issues</w:t>
+      </w:r>
+      <w:proofErr w:type="gramEnd"/>
+      <w:r>
+        <w:rPr>
+          <w:b/>
+          <w:bCs/>
+        </w:rPr>
+        <w:t>.</w:t>
+      </w:r>
+    </w:p>
+    <w:p>
+      <w:r>
+        <w:t xml:space="preserve">1."if someone enter same idea in the this have to give </w:t>
+      </w:r>
+      <w:proofErr w:type="gramStart"/>
+      <w:r>
+        <w:t>a</w:t>
+      </w:r>
+      <w:proofErr w:type="gramEnd"/>
+      <w:r>
+        <w:t xml:space="preserve"> error of the idea is already exist kindly enter new idea</w:t>
       </w:r>
     </w:p>
     <w:p>
@@ -264,7 +339,15 @@
       </w:r>
       <w:proofErr w:type="spellEnd"/>
       <w:r>
-        <w:t xml:space="preserve"> it have to be </w:t>
+        <w:t xml:space="preserve"> it </w:t>
+      </w:r>
+      <w:proofErr w:type="gramStart"/>
+      <w:r>
+        <w:t>have</w:t>
+      </w:r>
+      <w:proofErr w:type="gramEnd"/>
+      <w:r>
+        <w:t xml:space="preserve"> to be </w:t>
       </w:r>
       <w:proofErr w:type="spellStart"/>
       <w:r>
@@ -272,7 +355,10 @@
       </w:r>
       <w:proofErr w:type="spellEnd"/>
       <w:r>
-        <w:t xml:space="preserve"> and have to match both light and dark</w:t>
+        <w:t xml:space="preserve"> an</w:t>
+      </w:r>
+      <w:r>
+        <w:t>d have to match both light and dark</w:t>
       </w:r>
     </w:p>
     <w:p>
@@ -382,7 +468,17 @@
           <w:lang w:eastAsia="zh-CN" w:bidi="ar"/>
         </w:rPr>
         <w:br/>
-        <w:t>Modify the code so that leading and trailing spaces are removed before saving the idea.</w:t>
+        <w:t>Modify the co</w:t>
+      </w:r>
+      <w:r>
+        <w:rPr>
+          <w:rFonts w:ascii="SimSun" w:eastAsia="SimSun" w:hAnsi="SimSun" w:cs="SimSun"/>
+          <w:kern w:val="0"/>
+          <w:sz w:val="24"/>
+          <w:szCs w:val="24"/>
+          <w:lang w:eastAsia="zh-CN" w:bidi="ar"/>
+        </w:rPr>
+        <w:t>de so that leading and trailing spaces are removed before saving the idea.</w:t>
       </w:r>
       <w:r>
         <w:rPr>
@@ -468,7 +564,17 @@
           <w:lang w:eastAsia="zh-CN" w:bidi="ar"/>
         </w:rPr>
         <w:br/>
-        <w:t>- Show an alert or message if the idea already exists</w:t>
+        <w:t xml:space="preserve">- Show an alert or message </w:t>
+      </w:r>
+      <w:r>
+        <w:rPr>
+          <w:rFonts w:ascii="SimSun" w:eastAsia="SimSun" w:hAnsi="SimSun" w:cs="SimSun"/>
+          <w:kern w:val="0"/>
+          <w:sz w:val="24"/>
+          <w:szCs w:val="24"/>
+          <w:lang w:eastAsia="zh-CN" w:bidi="ar"/>
+        </w:rPr>
+        <w:t>if the idea already exists</w:t>
       </w:r>
       <w:r>
         <w:rPr>
@@ -585,7 +691,17 @@
           <w:lang w:eastAsia="zh-CN" w:bidi="ar"/>
         </w:rPr>
         <w:br/>
-        <w:t>Modify the code so that ideas remain after refreshing the page.</w:t>
+        <w:t xml:space="preserve">Modify the code so that </w:t>
+      </w:r>
+      <w:r>
+        <w:rPr>
+          <w:rFonts w:ascii="SimSun" w:eastAsia="SimSun" w:hAnsi="SimSun" w:cs="SimSun"/>
+          <w:kern w:val="0"/>
+          <w:sz w:val="24"/>
+          <w:szCs w:val="24"/>
+          <w:lang w:eastAsia="zh-CN" w:bidi="ar"/>
+        </w:rPr>
+        <w:t>ideas remain after refreshing the page.</w:t>
       </w:r>
       <w:r>
         <w:rPr>
@@ -812,12 +928,28 @@
     </w:p>
     <w:p>
       <w:r>
-        <w:t xml:space="preserve">  symbols like { } [ ] \ | ^ ~ to prevent code injection and maintain a clean, human-readable board. To make the technology feel</w:t>
-      </w:r>
-    </w:p>
-    <w:p>
-      <w:r>
-        <w:t xml:space="preserve">  "alive," the UI utilizes a neon-like glowing border and a cinematic scanning light gradient that sweeps across the input field</w:t>
+        <w:t xml:space="preserve">  symbols like </w:t>
+      </w:r>
+      <w:proofErr w:type="gramStart"/>
+      <w:r>
+        <w:t>{ }</w:t>
+      </w:r>
+      <w:proofErr w:type="gramEnd"/>
+      <w:r>
+        <w:t xml:space="preserve"> [ ] \ | ^ ~ to prevent code injection and maintain a clean, human-readable board. To make the technology feel</w:t>
+      </w:r>
+    </w:p>
+    <w:p>
+      <w:r>
+        <w:t xml:space="preserve">  "</w:t>
+      </w:r>
+      <w:proofErr w:type="gramStart"/>
+      <w:r>
+        <w:t>alive</w:t>
+      </w:r>
+      <w:proofErr w:type="gramEnd"/>
+      <w:r>
+        <w:t>," the UI utilizes a neon-like glowing border and a cinematic scanning light gradient that sweeps across the input field</w:t>
       </w:r>
     </w:p>
     <w:p>
@@ -825,21 +957,293 @@
         <w:t xml:space="preserve">  while the AI processes data, turning a simple submission form into a high-tech, responsive experience.</w:t>
       </w:r>
     </w:p>
-    <w:p/>
-    <w:p>
-      <w:pPr>
-        <w:ind w:firstLine="720"/>
-        <w:rPr>
-          <w:sz w:val="18"/>
-          <w:szCs w:val="18"/>
-        </w:rPr>
-      </w:pPr>
-      <w:r>
-        <w:rPr>
-          <w:sz w:val="28"/>
-          <w:szCs w:val="28"/>
+    <w:p>
+      <w:pPr>
+        <w:rPr>
+          <w:sz w:val="18"/>
+          <w:szCs w:val="18"/>
+        </w:rPr>
+      </w:pPr>
+      <w:r>
+        <w:rPr>
+          <w:sz w:val="18"/>
+          <w:szCs w:val="18"/>
+        </w:rPr>
+        <w:t>1. For the UI &amp; Error Handling:</w:t>
+      </w:r>
+    </w:p>
+    <w:p>
+      <w:pPr>
+        <w:rPr>
+          <w:sz w:val="18"/>
+          <w:szCs w:val="18"/>
+        </w:rPr>
+      </w:pPr>
+      <w:r>
+        <w:rPr>
+          <w:sz w:val="18"/>
+          <w:szCs w:val="18"/>
+        </w:rPr>
+        <w:t xml:space="preserve">  &gt; "when user </w:t>
+      </w:r>
+      <w:proofErr w:type="spellStart"/>
+      <w:r>
+        <w:rPr>
+          <w:sz w:val="18"/>
+          <w:szCs w:val="18"/>
+        </w:rPr>
+        <w:t>dont</w:t>
+      </w:r>
+      <w:proofErr w:type="spellEnd"/>
+      <w:r>
+        <w:rPr>
+          <w:sz w:val="18"/>
+          <w:szCs w:val="18"/>
+        </w:rPr>
+        <w:t xml:space="preserve"> enter any data to the idea box and rapid press the add idea button and that time the </w:t>
+      </w:r>
+      <w:proofErr w:type="spellStart"/>
+      <w:r>
+        <w:rPr>
+          <w:sz w:val="18"/>
+          <w:szCs w:val="18"/>
+        </w:rPr>
+        <w:t>emty</w:t>
+      </w:r>
+      <w:proofErr w:type="spellEnd"/>
+      <w:r>
+        <w:rPr>
+          <w:sz w:val="18"/>
+          <w:szCs w:val="18"/>
+        </w:rPr>
+        <w:t xml:space="preserve"> input error will </w:t>
+      </w:r>
+      <w:proofErr w:type="spellStart"/>
+      <w:r>
+        <w:rPr>
+          <w:sz w:val="18"/>
+          <w:szCs w:val="18"/>
+        </w:rPr>
+        <w:t>apper</w:t>
+      </w:r>
+      <w:proofErr w:type="spellEnd"/>
+      <w:r>
+        <w:rPr>
+          <w:sz w:val="18"/>
+          <w:szCs w:val="18"/>
+        </w:rPr>
+        <w:t xml:space="preserve"> but </w:t>
+      </w:r>
+      <w:proofErr w:type="spellStart"/>
+      <w:r>
+        <w:rPr>
+          <w:sz w:val="18"/>
+          <w:szCs w:val="18"/>
+        </w:rPr>
+        <w:t>dont</w:t>
+      </w:r>
+      <w:proofErr w:type="spellEnd"/>
+      <w:r>
+        <w:rPr>
+          <w:sz w:val="18"/>
+          <w:szCs w:val="18"/>
+        </w:rPr>
+        <w:t xml:space="preserve"> get</w:t>
+      </w:r>
+    </w:p>
+    <w:p>
+      <w:pPr>
+        <w:rPr>
+          <w:sz w:val="18"/>
+          <w:szCs w:val="18"/>
+        </w:rPr>
+      </w:pPr>
+      <w:r>
+        <w:rPr>
+          <w:sz w:val="18"/>
+          <w:szCs w:val="18"/>
+        </w:rPr>
+        <w:t xml:space="preserve">  rapid errors in close to the add idea button that way the add idea button cover with </w:t>
+      </w:r>
+      <w:proofErr w:type="spellStart"/>
+      <w:r>
+        <w:rPr>
+          <w:sz w:val="18"/>
+          <w:szCs w:val="18"/>
+        </w:rPr>
+        <w:t>emty</w:t>
+      </w:r>
+      <w:proofErr w:type="spellEnd"/>
+      <w:r>
+        <w:rPr>
+          <w:sz w:val="18"/>
+          <w:szCs w:val="18"/>
+        </w:rPr>
+        <w:t xml:space="preserve"> input error so reduce the opacity of error box when it</w:t>
+      </w:r>
+    </w:p>
+    <w:p>
+      <w:pPr>
+        <w:rPr>
+          <w:sz w:val="18"/>
+          <w:szCs w:val="18"/>
+        </w:rPr>
+      </w:pPr>
+      <w:r>
+        <w:rPr>
+          <w:sz w:val="18"/>
+          <w:szCs w:val="18"/>
+        </w:rPr>
+        <w:t xml:space="preserve">  close to the add idea button"</w:t>
+      </w:r>
+    </w:p>
+    <w:p>
+      <w:pPr>
+        <w:rPr>
+          <w:sz w:val="18"/>
+          <w:szCs w:val="18"/>
+        </w:rPr>
+      </w:pPr>
+    </w:p>
+    <w:p>
+      <w:pPr>
+        <w:rPr>
+          <w:sz w:val="18"/>
+          <w:szCs w:val="18"/>
+        </w:rPr>
+      </w:pPr>
+    </w:p>
+    <w:p>
+      <w:pPr>
+        <w:rPr>
+          <w:sz w:val="18"/>
+          <w:szCs w:val="18"/>
+        </w:rPr>
+      </w:pPr>
+      <w:r>
+        <w:rPr>
+          <w:sz w:val="18"/>
+          <w:szCs w:val="18"/>
+        </w:rPr>
+        <w:t xml:space="preserve">  2. For the AI Summarization:</w:t>
+      </w:r>
+    </w:p>
+    <w:p>
+      <w:pPr>
+        <w:rPr>
+          <w:sz w:val="18"/>
+          <w:szCs w:val="18"/>
+        </w:rPr>
+      </w:pPr>
+      <w:r>
+        <w:rPr>
+          <w:sz w:val="18"/>
+          <w:szCs w:val="18"/>
+        </w:rPr>
+        <w:t xml:space="preserve">  &gt; "the </w:t>
+      </w:r>
+      <w:proofErr w:type="spellStart"/>
+      <w:r>
+        <w:rPr>
+          <w:sz w:val="18"/>
+          <w:szCs w:val="18"/>
+        </w:rPr>
+        <w:t>summeryize</w:t>
+      </w:r>
+      <w:proofErr w:type="spellEnd"/>
+      <w:r>
+        <w:rPr>
+          <w:sz w:val="18"/>
+          <w:szCs w:val="18"/>
+        </w:rPr>
+        <w:t xml:space="preserve"> ai is like a baby </w:t>
+      </w:r>
+      <w:proofErr w:type="spellStart"/>
+      <w:r>
+        <w:rPr>
+          <w:sz w:val="18"/>
+          <w:szCs w:val="18"/>
+        </w:rPr>
+        <w:t>dont</w:t>
+      </w:r>
+      <w:proofErr w:type="spellEnd"/>
+      <w:r>
+        <w:rPr>
+          <w:sz w:val="18"/>
+          <w:szCs w:val="18"/>
+        </w:rPr>
+        <w:t xml:space="preserve"> do it like that way </w:t>
+      </w:r>
+      <w:proofErr w:type="spellStart"/>
+      <w:r>
+        <w:rPr>
+          <w:sz w:val="18"/>
+          <w:szCs w:val="18"/>
+        </w:rPr>
+        <w:t>insted</w:t>
+      </w:r>
+      <w:proofErr w:type="spellEnd"/>
+      <w:r>
+        <w:rPr>
+          <w:sz w:val="18"/>
+          <w:szCs w:val="18"/>
         </w:rPr>
         <w:t xml:space="preserve"> </w:t>
+      </w:r>
+      <w:proofErr w:type="spellStart"/>
+      <w:r>
+        <w:rPr>
+          <w:sz w:val="18"/>
+          <w:szCs w:val="18"/>
+        </w:rPr>
+        <w:t>summrise</w:t>
+      </w:r>
+      <w:proofErr w:type="spellEnd"/>
+      <w:r>
+        <w:rPr>
+          <w:sz w:val="18"/>
+          <w:szCs w:val="18"/>
+        </w:rPr>
+        <w:t xml:space="preserve"> it like professional and can read and </w:t>
+      </w:r>
+      <w:proofErr w:type="spellStart"/>
+      <w:r>
+        <w:rPr>
+          <w:sz w:val="18"/>
+          <w:szCs w:val="18"/>
+        </w:rPr>
+        <w:t>meaninfully</w:t>
+      </w:r>
+      <w:proofErr w:type="spellEnd"/>
+      <w:r>
+        <w:rPr>
+          <w:sz w:val="18"/>
+          <w:szCs w:val="18"/>
+        </w:rPr>
+        <w:t>"</w:t>
+      </w:r>
+    </w:p>
+    <w:p>
+      <w:pPr>
+        <w:rPr>
+          <w:sz w:val="18"/>
+          <w:szCs w:val="18"/>
+        </w:rPr>
+      </w:pPr>
+    </w:p>
+    <w:p>
+      <w:pPr>
+        <w:rPr>
+          <w:sz w:val="18"/>
+          <w:szCs w:val="18"/>
+        </w:rPr>
+      </w:pPr>
+      <w:r>
+        <w:rPr>
+          <w:sz w:val="18"/>
+          <w:szCs w:val="18"/>
+        </w:rPr>
+        <w:t xml:space="preserve">                                                                                                                        </w:t>
       </w:r>
     </w:p>
     <w:sectPr>
@@ -853,7 +1257,7 @@
 </file>
 
 <file path=word/endnotes.xml><?xml version="1.0" encoding="utf-8"?>
-<w:endnotes xmlns:wpc="http://schemas.microsoft.com/office/word/2010/wordprocessingCanvas" xmlns:cx="http://schemas.microsoft.com/office/drawing/2014/chartex" xmlns:cx1="http://schemas.microsoft.com/office/drawing/2015/9/8/chartex" xmlns:cx2="http://schemas.microsoft.com/office/drawing/2015/10/21/chartex" xmlns:cx3="http://schemas.microsoft.com/office/drawing/2016/5/9/chartex" xmlns:cx4="http://schemas.microsoft.com/office/drawing/2016/5/10/chartex" xmlns:cx5="http://schemas.microsoft.com/office/drawing/2016/5/11/chartex" xmlns:cx6="http://schemas.microsoft.com/office/drawing/2016/5/12/chartex" xmlns:cx7="http://schemas.microsoft.com/office/drawing/2016/5/13/chartex" xmlns:cx8="http://schemas.microsoft.com/office/drawing/2016/5/14/chartex" xmlns:mc="http://schemas.openxmlformats.org/markup-compatibility/2006" xmlns:aink="http://schemas.microsoft.com/office/drawing/2016/ink" xmlns:am3d="http://schemas.microsoft.com/office/drawing/2017/model3d" xmlns:o="urn:schemas-microsoft-com:office:office" xmlns:oel="http://schemas.microsoft.com/office/2019/extlst" xmlns:r="http://schemas.openxmlformats.org/officeDocument/2006/relationships" xmlns:m="http://schemas.openxmlformats.org/officeDocument/2006/math" xmlns:v="urn:schemas-microsoft-com:vml" xmlns:wp14="http://schemas.microsoft.com/office/word/2010/wordprocessingDrawing" xmlns:wp="http://schemas.openxmlformats.org/drawingml/2006/wordprocessingDrawing" xmlns:w10="urn:schemas-microsoft-com:office:word" xmlns:w="http://schemas.openxmlformats.org/wordprocessingml/2006/main" xmlns:w14="http://schemas.microsoft.com/office/word/2010/wordml" xmlns:w15="http://schemas.microsoft.com/office/word/2012/wordml" xmlns:w16cex="http://schemas.microsoft.com/office/word/2018/wordml/cex" xmlns:w16cid="http://schemas.microsoft.com/office/word/2016/wordml/cid" xmlns:w16="http://schemas.microsoft.com/office/word/2018/wordml" xmlns:w16du="http://schemas.microsoft.com/office/word/2023/wordml/word16du" xmlns:w16sdtdh="http://schemas.microsoft.com/office/word/2020/wordml/sdtdatahash" xmlns:w16sdtfl="http://schemas.microsoft.com/office/word/2024/wordml/sdtformatlock" xmlns:w16se="http://schemas.microsoft.com/office/word/2015/wordml/symex" xmlns:wpg="http://schemas.microsoft.com/office/word/2010/wordprocessingGroup" xmlns:wpi="http://schemas.microsoft.com/office/word/2010/wordprocessingInk" xmlns:wne="http://schemas.microsoft.com/office/word/2006/wordml" xmlns:wps="http://schemas.microsoft.com/office/word/2010/wordprocessingShape" mc:Ignorable="w14 w15 w16se w16cid w16 w16cex w16sdtdh w16sdtfl w16du wp14">
+<w:endnotes xmlns:wpc="http://schemas.microsoft.com/office/word/2010/wordprocessingCanvas" xmlns:cx="http://schemas.microsoft.com/office/drawing/2014/chartex" xmlns:cx1="http://schemas.microsoft.com/office/drawing/2015/9/8/chartex" xmlns:cx2="http://schemas.microsoft.com/office/drawing/2015/10/21/chartex" xmlns:cx3="http://schemas.microsoft.com/office/drawing/2016/5/9/chartex" xmlns:cx4="http://schemas.microsoft.com/office/drawing/2016/5/10/chartex" xmlns:cx5="http://schemas.microsoft.com/office/drawing/2016/5/11/chartex" xmlns:cx6="http://schemas.microsoft.com/office/drawing/2016/5/12/chartex" xmlns:cx7="http://schemas.microsoft.com/office/drawing/2016/5/13/chartex" xmlns:cx8="http://schemas.microsoft.com/office/drawing/2016/5/14/chartex" xmlns:mc="http://schemas.openxmlformats.org/markup-compatibility/2006" xmlns:aink="http://schemas.microsoft.com/office/drawing/2016/ink" xmlns:am3d="http://schemas.microsoft.com/office/drawing/2017/model3d" xmlns:o="urn:schemas-microsoft-com:office:office" xmlns:r="http://schemas.openxmlformats.org/officeDocument/2006/relationships" xmlns:m="http://schemas.openxmlformats.org/officeDocument/2006/math" xmlns:v="urn:schemas-microsoft-com:vml" xmlns:wp14="http://schemas.microsoft.com/office/word/2010/wordprocessingDrawing" xmlns:wp="http://schemas.openxmlformats.org/drawingml/2006/wordprocessingDrawing" xmlns:w10="urn:schemas-microsoft-com:office:word" xmlns:w="http://schemas.openxmlformats.org/wordprocessingml/2006/main" xmlns:w14="http://schemas.microsoft.com/office/word/2010/wordml" xmlns:w15="http://schemas.microsoft.com/office/word/2012/wordml" xmlns:w16cex="http://schemas.microsoft.com/office/word/2018/wordml/cex" xmlns:w16cid="http://schemas.microsoft.com/office/word/2016/wordml/cid" xmlns:w16="http://schemas.microsoft.com/office/word/2018/wordml" xmlns:w16sdtdh="http://schemas.microsoft.com/office/word/2020/wordml/sdtdatahash" xmlns:w16se="http://schemas.microsoft.com/office/word/2015/wordml/symex" xmlns:wpg="http://schemas.microsoft.com/office/word/2010/wordprocessingGroup" xmlns:wpi="http://schemas.microsoft.com/office/word/2010/wordprocessingInk" xmlns:wne="http://schemas.microsoft.com/office/word/2006/wordml" xmlns:wps="http://schemas.microsoft.com/office/word/2010/wordprocessingShape" mc:Ignorable="w14 w15 w16se w16cid w16 w16cex w16sdtdh wp14">
   <w:endnote w:type="separator" w:id="-1">
     <w:p>
       <w:pPr>
@@ -878,7 +1282,7 @@
 </file>
 
 <file path=word/footnotes.xml><?xml version="1.0" encoding="utf-8"?>
-<w:footnotes xmlns:wpc="http://schemas.microsoft.com/office/word/2010/wordprocessingCanvas" xmlns:cx="http://schemas.microsoft.com/office/drawing/2014/chartex" xmlns:cx1="http://schemas.microsoft.com/office/drawing/2015/9/8/chartex" xmlns:cx2="http://schemas.microsoft.com/office/drawing/2015/10/21/chartex" xmlns:cx3="http://schemas.microsoft.com/office/drawing/2016/5/9/chartex" xmlns:cx4="http://schemas.microsoft.com/office/drawing/2016/5/10/chartex" xmlns:cx5="http://schemas.microsoft.com/office/drawing/2016/5/11/chartex" xmlns:cx6="http://schemas.microsoft.com/office/drawing/2016/5/12/chartex" xmlns:cx7="http://schemas.microsoft.com/office/drawing/2016/5/13/chartex" xmlns:cx8="http://schemas.microsoft.com/office/drawing/2016/5/14/chartex" xmlns:mc="http://schemas.openxmlformats.org/markup-compatibility/2006" xmlns:aink="http://schemas.microsoft.com/office/drawing/2016/ink" xmlns:am3d="http://schemas.microsoft.com/office/drawing/2017/model3d" xmlns:o="urn:schemas-microsoft-com:office:office" xmlns:oel="http://schemas.microsoft.com/office/2019/extlst" xmlns:r="http://schemas.openxmlformats.org/officeDocument/2006/relationships" xmlns:m="http://schemas.openxmlformats.org/officeDocument/2006/math" xmlns:v="urn:schemas-microsoft-com:vml" xmlns:wp14="http://schemas.microsoft.com/office/word/2010/wordprocessingDrawing" xmlns:wp="http://schemas.openxmlformats.org/drawingml/2006/wordprocessingDrawing" xmlns:w10="urn:schemas-microsoft-com:office:word" xmlns:w="http://schemas.openxmlformats.org/wordprocessingml/2006/main" xmlns:w14="http://schemas.microsoft.com/office/word/2010/wordml" xmlns:w15="http://schemas.microsoft.com/office/word/2012/wordml" xmlns:w16cex="http://schemas.microsoft.com/office/word/2018/wordml/cex" xmlns:w16cid="http://schemas.microsoft.com/office/word/2016/wordml/cid" xmlns:w16="http://schemas.microsoft.com/office/word/2018/wordml" xmlns:w16du="http://schemas.microsoft.com/office/word/2023/wordml/word16du" xmlns:w16sdtdh="http://schemas.microsoft.com/office/word/2020/wordml/sdtdatahash" xmlns:w16sdtfl="http://schemas.microsoft.com/office/word/2024/wordml/sdtformatlock" xmlns:w16se="http://schemas.microsoft.com/office/word/2015/wordml/symex" xmlns:wpg="http://schemas.microsoft.com/office/word/2010/wordprocessingGroup" xmlns:wpi="http://schemas.microsoft.com/office/word/2010/wordprocessingInk" xmlns:wne="http://schemas.microsoft.com/office/word/2006/wordml" xmlns:wps="http://schemas.microsoft.com/office/word/2010/wordprocessingShape" mc:Ignorable="w14 w15 w16se w16cid w16 w16cex w16sdtdh w16sdtfl w16du wp14">
+<w:footnotes xmlns:wpc="http://schemas.microsoft.com/office/word/2010/wordprocessingCanvas" xmlns:cx="http://schemas.microsoft.com/office/drawing/2014/chartex" xmlns:cx1="http://schemas.microsoft.com/office/drawing/2015/9/8/chartex" xmlns:cx2="http://schemas.microsoft.com/office/drawing/2015/10/21/chartex" xmlns:cx3="http://schemas.microsoft.com/office/drawing/2016/5/9/chartex" xmlns:cx4="http://schemas.microsoft.com/office/drawing/2016/5/10/chartex" xmlns:cx5="http://schemas.microsoft.com/office/drawing/2016/5/11/chartex" xmlns:cx6="http://schemas.microsoft.com/office/drawing/2016/5/12/chartex" xmlns:cx7="http://schemas.microsoft.com/office/drawing/2016/5/13/chartex" xmlns:cx8="http://schemas.microsoft.com/office/drawing/2016/5/14/chartex" xmlns:mc="http://schemas.openxmlformats.org/markup-compatibility/2006" xmlns:aink="http://schemas.microsoft.com/office/drawing/2016/ink" xmlns:am3d="http://schemas.microsoft.com/office/drawing/2017/model3d" xmlns:o="urn:schemas-microsoft-com:office:office" xmlns:r="http://schemas.openxmlformats.org/officeDocument/2006/relationships" xmlns:m="http://schemas.openxmlformats.org/officeDocument/2006/math" xmlns:v="urn:schemas-microsoft-com:vml" xmlns:wp14="http://schemas.microsoft.com/office/word/2010/wordprocessingDrawing" xmlns:wp="http://schemas.openxmlformats.org/drawingml/2006/wordprocessingDrawing" xmlns:w10="urn:schemas-microsoft-com:office:word" xmlns:w="http://schemas.openxmlformats.org/wordprocessingml/2006/main" xmlns:w14="http://schemas.microsoft.com/office/word/2010/wordml" xmlns:w15="http://schemas.microsoft.com/office/word/2012/wordml" xmlns:w16cex="http://schemas.microsoft.com/office/word/2018/wordml/cex" xmlns:w16cid="http://schemas.microsoft.com/office/word/2016/wordml/cid" xmlns:w16="http://schemas.microsoft.com/office/word/2018/wordml" xmlns:w16sdtdh="http://schemas.microsoft.com/office/word/2020/wordml/sdtdatahash" xmlns:w16se="http://schemas.microsoft.com/office/word/2015/wordml/symex" xmlns:wpg="http://schemas.microsoft.com/office/word/2010/wordprocessingGroup" xmlns:wpi="http://schemas.microsoft.com/office/word/2010/wordprocessingInk" xmlns:wne="http://schemas.microsoft.com/office/word/2006/wordml" xmlns:wps="http://schemas.microsoft.com/office/word/2010/wordprocessingShape" mc:Ignorable="w14 w15 w16se w16cid w16 w16cex w16sdtdh wp14">
   <w:footnote w:type="separator" w:id="-1">
     <w:p>
       <w:pPr>
@@ -903,7 +1307,7 @@
 </file>
 
 <file path=word/styles.xml><?xml version="1.0" encoding="utf-8"?>
-<w:styles xmlns:mc="http://schemas.openxmlformats.org/markup-compatibility/2006" xmlns:r="http://schemas.openxmlformats.org/officeDocument/2006/relationships" xmlns:w="http://schemas.openxmlformats.org/wordprocessingml/2006/main" xmlns:w14="http://schemas.microsoft.com/office/word/2010/wordml" xmlns:w15="http://schemas.microsoft.com/office/word/2012/wordml" xmlns:w16cex="http://schemas.microsoft.com/office/word/2018/wordml/cex" xmlns:w16cid="http://schemas.microsoft.com/office/word/2016/wordml/cid" xmlns:w16="http://schemas.microsoft.com/office/word/2018/wordml" xmlns:w16du="http://schemas.microsoft.com/office/word/2023/wordml/word16du" xmlns:w16sdtdh="http://schemas.microsoft.com/office/word/2020/wordml/sdtdatahash" xmlns:w16sdtfl="http://schemas.microsoft.com/office/word/2024/wordml/sdtformatlock" xmlns:w16se="http://schemas.microsoft.com/office/word/2015/wordml/symex" mc:Ignorable="w14 w15 w16se w16cid w16 w16cex w16sdtdh w16sdtfl w16du">
+<w:styles xmlns:mc="http://schemas.openxmlformats.org/markup-compatibility/2006" xmlns:r="http://schemas.openxmlformats.org/officeDocument/2006/relationships" xmlns:w="http://schemas.openxmlformats.org/wordprocessingml/2006/main" xmlns:w14="http://schemas.microsoft.com/office/word/2010/wordml" xmlns:w15="http://schemas.microsoft.com/office/word/2012/wordml" xmlns:w16cex="http://schemas.microsoft.com/office/word/2018/wordml/cex" xmlns:w16cid="http://schemas.microsoft.com/office/word/2016/wordml/cid" xmlns:w16="http://schemas.microsoft.com/office/word/2018/wordml" xmlns:w16sdtdh="http://schemas.microsoft.com/office/word/2020/wordml/sdtdatahash" xmlns:w16se="http://schemas.microsoft.com/office/word/2015/wordml/symex" mc:Ignorable="w14 w15 w16se w16cid w16 w16cex w16sdtdh">
   <w:docDefaults>
     <w:rPrDefault>
       <w:rPr>
@@ -1498,6 +1902,7 @@
   <w:style w:type="character" w:default="1" w:styleId="DefaultParagraphFont">
     <w:name w:val="Default Paragraph Font"/>
     <w:uiPriority w:val="1"/>
+    <w:semiHidden/>
     <w:unhideWhenUsed/>
   </w:style>
   <w:style w:type="table" w:default="1" w:styleId="TableNormal">

</xml_diff>